<commit_message>
fix(packages/bensz-paper): 修复 cover letter DOCX 正文与 PDF 不一致
- manuscript_tool.py 在 DOCX 片段转换前提取并展开无参数 \newcommand 元数据宏
- 移除会干扰 Pandoc 日期前导数字转换的 \noindent 指令
- 补充跨片段宏展开回归测试

Co-Authored-By: Claude Opus 4.6 <noreply@anthropic.com>
</commit_message>
<xml_diff>
--- a/projects/paper-coverletter-01/main.docx
+++ b/projects/paper-coverletter-01/main.docx
@@ -9,13 +9,7 @@
         <w:ind w:firstLine="0"/>
       </w:pPr>
       <w:r>
-        <w:t xml:space="preserve">We are pleased to submit our manuscript, entitled “,” for</w:t>
-      </w:r>
-      <w:r>
-        <w:t xml:space="preserve"> </w:t>
-      </w:r>
-      <w:r>
-        <w:t xml:space="preserve">consideration at .</w:t>
+        <w:t xml:space="preserve">31 March 2026</w:t>
       </w:r>
     </w:p>
     <w:p>
@@ -25,43 +19,7 @@
         <w:ind w:firstLine="0"/>
       </w:pPr>
       <w:r>
-        <w:t xml:space="preserve">This template example presents an anonymized translational oncology</w:t>
-      </w:r>
-      <w:r>
-        <w:t xml:space="preserve"> </w:t>
-      </w:r>
-      <w:r>
-        <w:t xml:space="preserve">study that integrates multi-cohort transcriptomic evidence,</w:t>
-      </w:r>
-      <w:r>
-        <w:t xml:space="preserve"> </w:t>
-      </w:r>
-      <w:r>
-        <w:t xml:space="preserve">interpretable response stratification, and clinically relevant biomarker</w:t>
-      </w:r>
-      <w:r>
-        <w:t xml:space="preserve"> </w:t>
-      </w:r>
-      <w:r>
-        <w:t xml:space="preserve">framing. The paragraph is intentionally written as a reusable</w:t>
-      </w:r>
-      <w:r>
-        <w:t xml:space="preserve"> </w:t>
-      </w:r>
-      <w:r>
-        <w:t xml:space="preserve">demonstration block: it shows how to summarize the core question, the</w:t>
-      </w:r>
-      <w:r>
-        <w:t xml:space="preserve"> </w:t>
-      </w:r>
-      <w:r>
-        <w:t xml:space="preserve">methodological contribution, and the major translational implication</w:t>
-      </w:r>
-      <w:r>
-        <w:t xml:space="preserve"> </w:t>
-      </w:r>
-      <w:r>
-        <w:t xml:space="preserve">without disclosing a real unpublished manuscript.</w:t>
+        <w:t xml:space="preserve">Editors of [Target Journal]</w:t>
       </w:r>
     </w:p>
     <w:p>
@@ -71,43 +29,7 @@
         <w:ind w:firstLine="0"/>
       </w:pPr>
       <w:r>
-        <w:t xml:space="preserve">We believe this work is well suited to  because it connects</w:t>
-      </w:r>
-      <w:r>
-        <w:t xml:space="preserve"> </w:t>
-      </w:r>
-      <w:r>
-        <w:t xml:space="preserve">systems-level cancer biology with a practical clinical use case,</w:t>
-      </w:r>
-      <w:r>
-        <w:t xml:space="preserve"> </w:t>
-      </w:r>
-      <w:r>
-        <w:t xml:space="preserve">emphasizes interpretability rather than black-box prediction, and</w:t>
-      </w:r>
-      <w:r>
-        <w:t xml:space="preserve"> </w:t>
-      </w:r>
-      <w:r>
-        <w:t xml:space="preserve">illustrates how a single-sample assay framework can be positioned for</w:t>
-      </w:r>
-      <w:r>
-        <w:t xml:space="preserve"> </w:t>
-      </w:r>
-      <w:r>
-        <w:t xml:space="preserve">downstream validation. When adapting this template, authors can replace</w:t>
-      </w:r>
-      <w:r>
-        <w:t xml:space="preserve"> </w:t>
-      </w:r>
-      <w:r>
-        <w:t xml:space="preserve">this paragraph with a concise explanation of novelty, significance, and</w:t>
-      </w:r>
-      <w:r>
-        <w:t xml:space="preserve"> </w:t>
-      </w:r>
-      <w:r>
-        <w:t xml:space="preserve">fit for the target journal.</w:t>
+        <w:t xml:space="preserve">Dear Editors,</w:t>
       </w:r>
     </w:p>
     <w:p>
@@ -117,25 +39,19 @@
         <w:ind w:firstLine="0"/>
       </w:pPr>
       <w:r>
-        <w:t xml:space="preserve">All authors have approved the manuscript and agree with its</w:t>
+        <w:t xml:space="preserve">We are pleased to submit our manuscript, entitled “Template Example:</w:t>
       </w:r>
       <w:r>
         <w:t xml:space="preserve"> </w:t>
       </w:r>
       <w:r>
-        <w:t xml:space="preserve">submission to . This manuscript has not been published and is not under</w:t>
+        <w:t xml:space="preserve">A Multi-Cohort Translational Oncology Study,” for consideration at</w:t>
       </w:r>
       <w:r>
         <w:t xml:space="preserve"> </w:t>
       </w:r>
       <w:r>
-        <w:t xml:space="preserve">consideration elsewhere, and any competing interests should be disclosed</w:t>
-      </w:r>
-      <w:r>
-        <w:t xml:space="preserve"> </w:t>
-      </w:r>
-      <w:r>
-        <w:t xml:space="preserve">consistently with the manuscript file.</w:t>
+        <w:t xml:space="preserve">[Target Journal].</w:t>
       </w:r>
     </w:p>
     <w:p>
@@ -145,13 +61,43 @@
         <w:ind w:firstLine="0"/>
       </w:pPr>
       <w:r>
-        <w:t xml:space="preserve">We appreciate your time and consideration, and we hope the manuscript</w:t>
+        <w:t xml:space="preserve">This template example presents an anonymized translational oncology</w:t>
       </w:r>
       <w:r>
         <w:t xml:space="preserve"> </w:t>
       </w:r>
       <w:r>
-        <w:t xml:space="preserve">will be suitable for external peer review.</w:t>
+        <w:t xml:space="preserve">study that integrates multi-cohort transcriptomic evidence,</w:t>
+      </w:r>
+      <w:r>
+        <w:t xml:space="preserve"> </w:t>
+      </w:r>
+      <w:r>
+        <w:t xml:space="preserve">interpretable response stratification, and clinically relevant biomarker</w:t>
+      </w:r>
+      <w:r>
+        <w:t xml:space="preserve"> </w:t>
+      </w:r>
+      <w:r>
+        <w:t xml:space="preserve">framing. The paragraph is intentionally written as a reusable</w:t>
+      </w:r>
+      <w:r>
+        <w:t xml:space="preserve"> </w:t>
+      </w:r>
+      <w:r>
+        <w:t xml:space="preserve">demonstration block: it shows how to summarize the core question, the</w:t>
+      </w:r>
+      <w:r>
+        <w:t xml:space="preserve"> </w:t>
+      </w:r>
+      <w:r>
+        <w:t xml:space="preserve">methodological contribution, and the major translational implication</w:t>
+      </w:r>
+      <w:r>
+        <w:t xml:space="preserve"> </w:t>
+      </w:r>
+      <w:r>
+        <w:t xml:space="preserve">without disclosing a real unpublished manuscript.</w:t>
       </w:r>
     </w:p>
     <w:p>
@@ -161,7 +107,137 @@
         <w:ind w:firstLine="0"/>
       </w:pPr>
       <w:r>
+        <w:t xml:space="preserve">We believe this work is well suited to [Target Journal] because it</w:t>
+      </w:r>
+      <w:r>
+        <w:t xml:space="preserve"> </w:t>
+      </w:r>
+      <w:r>
+        <w:t xml:space="preserve">connects systems-level cancer biology with a practical clinical use</w:t>
+      </w:r>
+      <w:r>
+        <w:t xml:space="preserve"> </w:t>
+      </w:r>
+      <w:r>
+        <w:t xml:space="preserve">case, emphasizes interpretability rather than black-box prediction, and</w:t>
+      </w:r>
+      <w:r>
+        <w:t xml:space="preserve"> </w:t>
+      </w:r>
+      <w:r>
+        <w:t xml:space="preserve">illustrates how a single-sample assay framework can be positioned for</w:t>
+      </w:r>
+      <w:r>
+        <w:t xml:space="preserve"> </w:t>
+      </w:r>
+      <w:r>
+        <w:t xml:space="preserve">downstream validation. When adapting this template, authors can replace</w:t>
+      </w:r>
+      <w:r>
+        <w:t xml:space="preserve"> </w:t>
+      </w:r>
+      <w:r>
+        <w:t xml:space="preserve">this paragraph with a concise explanation of novelty, significance, and</w:t>
+      </w:r>
+      <w:r>
+        <w:t xml:space="preserve"> </w:t>
+      </w:r>
+      <w:r>
+        <w:t xml:space="preserve">fit for the target journal.</w:t>
+      </w:r>
+    </w:p>
+    <w:p>
+      <w:pPr>
+        <w:pStyle w:val="BodyText"/>
+        <w:spacing w:line="360" w:lineRule="auto" w:after="80" w:before="0"/>
+        <w:ind w:firstLine="0"/>
+      </w:pPr>
+      <w:r>
+        <w:t xml:space="preserve">All authors have approved the manuscript and agree with its</w:t>
+      </w:r>
+      <w:r>
+        <w:t xml:space="preserve"> </w:t>
+      </w:r>
+      <w:r>
+        <w:t xml:space="preserve">submission to [Target Journal]. This manuscript has not been published</w:t>
+      </w:r>
+      <w:r>
+        <w:t xml:space="preserve"> </w:t>
+      </w:r>
+      <w:r>
+        <w:t xml:space="preserve">and is not under consideration elsewhere, and any competing interests</w:t>
+      </w:r>
+      <w:r>
+        <w:t xml:space="preserve"> </w:t>
+      </w:r>
+      <w:r>
+        <w:t xml:space="preserve">should be disclosed consistently with the manuscript file.</w:t>
+      </w:r>
+    </w:p>
+    <w:p>
+      <w:pPr>
+        <w:pStyle w:val="BodyText"/>
+        <w:spacing w:line="360" w:lineRule="auto" w:after="80" w:before="0"/>
+        <w:ind w:firstLine="0"/>
+      </w:pPr>
+      <w:r>
+        <w:t xml:space="preserve">We appreciate your time and consideration, and we hope the manuscript</w:t>
+      </w:r>
+      <w:r>
+        <w:t xml:space="preserve"> </w:t>
+      </w:r>
+      <w:r>
+        <w:t xml:space="preserve">will be suitable for external peer review.</w:t>
+      </w:r>
+    </w:p>
+    <w:p>
+      <w:pPr>
+        <w:pStyle w:val="BodyText"/>
+        <w:spacing w:line="360" w:lineRule="auto" w:after="80" w:before="0"/>
+        <w:ind w:firstLine="0"/>
+      </w:pPr>
+      <w:r>
         <w:t xml:space="preserve">Sincerely,</w:t>
+      </w:r>
+    </w:p>
+    <w:p>
+      <w:pPr>
+        <w:pStyle w:val="BodyText"/>
+        <w:spacing w:line="360" w:lineRule="auto" w:after="80" w:before="0"/>
+        <w:ind w:firstLine="0"/>
+      </w:pPr>
+      <w:r>
+        <w:t xml:space="preserve">Feng BaoBao</w:t>
+      </w:r>
+    </w:p>
+    <w:p>
+      <w:pPr>
+        <w:pStyle w:val="BodyText"/>
+        <w:spacing w:line="360" w:lineRule="auto" w:after="80" w:before="0"/>
+        <w:ind w:firstLine="0"/>
+      </w:pPr>
+      <w:r>
+        <w:t xml:space="preserve">Corresponding Author</w:t>
+      </w:r>
+    </w:p>
+    <w:p>
+      <w:pPr>
+        <w:pStyle w:val="BodyText"/>
+        <w:spacing w:line="360" w:lineRule="auto" w:after="80" w:before="0"/>
+        <w:ind w:firstLine="0"/>
+      </w:pPr>
+      <w:r>
+        <w:t xml:space="preserve">Department of Translational Medicine, Example Research University</w:t>
+      </w:r>
+    </w:p>
+    <w:p>
+      <w:pPr>
+        <w:pStyle w:val="BodyText"/>
+        <w:spacing w:line="360" w:lineRule="auto" w:after="80" w:before="0"/>
+        <w:ind w:firstLine="0"/>
+      </w:pPr>
+      <w:r>
+        <w:t xml:space="preserve">feng.baobao@example.edu</w:t>
       </w:r>
     </w:p>
     <w:sectPr>

</xml_diff>